<commit_message>
Add garage shelf SEO guide and proof kit
</commit_message>
<xml_diff>
--- a/content/member-assets/ai-inbox-triage-trades/ai-automation-pack.docx
+++ b/content/member-assets/ai-inbox-triage-trades/ai-automation-pack.docx
@@ -759,7 +759,7 @@
               <w:pStyle w:val="TableCell"/>
             </w:pPr>
             <w:r>
-              <w:t xml:space="preserve">How to use these automations — Each automation below is a ready prompt you can paste into an AI agent (ChatGPT, Claude, or…</w:t>
+              <w:t xml:space="preserve">How to use these automations - Each automation below is a ready prompt you can paste into an AI agent (ChatGPT, Claude, or…</w:t>
             </w:r>
           </w:p>
         </w:tc>
@@ -801,7 +801,7 @@
               <w:pStyle w:val="TableCell"/>
             </w:pPr>
             <w:r>
-              <w:t xml:space="preserve">Automation schedule — Daily lead triage: every weekday morning.</w:t>
+              <w:t xml:space="preserve">Automation schedule - Daily lead triage: every weekday morning.</w:t>
             </w:r>
           </w:p>
         </w:tc>
@@ -845,7 +845,7 @@
               <w:pStyle w:val="TableCell"/>
             </w:pPr>
             <w:r>
-              <w:t xml:space="preserve">Daily lead triage — runs every weekday morning — You are an intake assistant for a ai inbox triage for trades serving trades businesses…</w:t>
+              <w:t xml:space="preserve">Daily lead triage - runs every weekday morning - You are an intake assistant for a ai inbox triage for trades serving trades businesses…</w:t>
             </w:r>
           </w:p>
         </w:tc>
@@ -887,7 +887,7 @@
               <w:pStyle w:val="TableCell"/>
             </w:pPr>
             <w:r>
-              <w:t xml:space="preserve">Weekly prospect list — runs every Monday — You are a local lead researcher for a ai inbox triage for trades. Target buyer: Trades…</w:t>
+              <w:t xml:space="preserve">Weekly prospect list - runs every Monday - You are a local lead researcher for a ai inbox triage for trades. Target buyer: Trades…</w:t>
             </w:r>
           </w:p>
         </w:tc>
@@ -931,7 +931,7 @@
               <w:pStyle w:val="TableCell"/>
             </w:pPr>
             <w:r>
-              <w:t xml:space="preserve">Outreach drafting prompt — runs twice a week — You write first-contact outreach for a ai inbox triage for trades aimed at trades…</w:t>
+              <w:t xml:space="preserve">Outreach drafting prompt - runs twice a week - You write first-contact outreach for a ai inbox triage for trades aimed at trades…</w:t>
             </w:r>
           </w:p>
         </w:tc>
@@ -973,7 +973,7 @@
               <w:pStyle w:val="TableCell"/>
             </w:pPr>
             <w:r>
-              <w:t xml:space="preserve">Follow-up sequencer prompt — runs every weekday — You manage polite follow-ups. Here are prospects with no reply and the days since first…</w:t>
+              <w:t xml:space="preserve">Follow-up sequencer prompt - runs every weekday - You manage polite follow-ups. Here are prospects with no reply and the days since first…</w:t>
             </w:r>
           </w:p>
         </w:tc>
@@ -1017,7 +1017,7 @@
               <w:pStyle w:val="TableCell"/>
             </w:pPr>
             <w:r>
-              <w:t xml:space="preserve">Delivery QA prompt — runs before every handoff — You are a delivery reviewer for a ai inbox triage for trades. Here is the draft…</w:t>
+              <w:t xml:space="preserve">Delivery QA prompt - runs before every handoff - You are a delivery reviewer for a ai inbox triage for trades. Here is the draft…</w:t>
             </w:r>
           </w:p>
         </w:tc>
@@ -1059,7 +1059,7 @@
               <w:pStyle w:val="TableCell"/>
             </w:pPr>
             <w:r>
-              <w:t xml:space="preserve">Weekly report and client update — runs every Friday — You report on a ai inbox triage for trades. Here is this week's activity: [prospects…</w:t>
+              <w:t xml:space="preserve">Weekly report and client update - runs every Friday - You report on a ai inbox triage for trades. Here is this week's activity: [prospects…</w:t>
             </w:r>
           </w:p>
         </w:tc>
@@ -1103,7 +1103,7 @@
               <w:pStyle w:val="TableCell"/>
             </w:pPr>
             <w:r>
-              <w:t xml:space="preserve">Proof and referral repurposing — runs after each completed job — You repurpose finished work for a ai inbox triage for trades. Here are the job details and…</w:t>
+              <w:t xml:space="preserve">Proof and referral repurposing - runs after each completed job - You repurpose finished work for a ai inbox triage for trades. Here are the job details and…</w:t>
             </w:r>
           </w:p>
         </w:tc>
@@ -1145,7 +1145,7 @@
               <w:pStyle w:val="TableCell"/>
             </w:pPr>
             <w:r>
-              <w:t xml:space="preserve">Delivery standards (shared) — This asset is for trades businesses; replace bracketed fields with their specifics before…</w:t>
+              <w:t xml:space="preserve">Delivery standards (shared) - This asset is for trades businesses; replace bracketed fields with their specifics before…</w:t>
             </w:r>
           </w:p>
         </w:tc>
@@ -1620,7 +1620,7 @@
         <w:pStyle w:val="Heading1"/>
       </w:pPr>
       <w:r>
-        <w:t xml:space="preserve">03 / Daily lead triage — runs every weekday morning</w:t>
+        <w:t xml:space="preserve">03 / Daily lead triage - runs every weekday morning</w:t>
       </w:r>
     </w:p>
     <w:p>
@@ -1636,7 +1636,7 @@
         <w:pStyle w:val="Heading1"/>
       </w:pPr>
       <w:r>
-        <w:t xml:space="preserve">04 / Weekly prospect list — runs every Monday</w:t>
+        <w:t xml:space="preserve">04 / Weekly prospect list - runs every Monday</w:t>
       </w:r>
     </w:p>
     <w:p>
@@ -1652,7 +1652,7 @@
         <w:pStyle w:val="Heading1"/>
       </w:pPr>
       <w:r>
-        <w:t xml:space="preserve">05 / Outreach drafting prompt — runs twice a week</w:t>
+        <w:t xml:space="preserve">05 / Outreach drafting prompt - runs twice a week</w:t>
       </w:r>
     </w:p>
     <w:p>
@@ -1668,7 +1668,7 @@
         <w:pStyle w:val="Heading1"/>
       </w:pPr>
       <w:r>
-        <w:t xml:space="preserve">06 / Follow-up sequencer prompt — runs every weekday</w:t>
+        <w:t xml:space="preserve">06 / Follow-up sequencer prompt - runs every weekday</w:t>
       </w:r>
     </w:p>
     <w:p>
@@ -1684,7 +1684,7 @@
         <w:pStyle w:val="Heading1"/>
       </w:pPr>
       <w:r>
-        <w:t xml:space="preserve">07 / Delivery QA prompt — runs before every handoff</w:t>
+        <w:t xml:space="preserve">07 / Delivery QA prompt - runs before every handoff</w:t>
       </w:r>
     </w:p>
     <w:p>
@@ -1700,7 +1700,7 @@
         <w:pStyle w:val="Heading1"/>
       </w:pPr>
       <w:r>
-        <w:t xml:space="preserve">08 / Weekly report and client update — runs every Friday</w:t>
+        <w:t xml:space="preserve">08 / Weekly report and client update - runs every Friday</w:t>
       </w:r>
     </w:p>
     <w:p>
@@ -1716,7 +1716,7 @@
         <w:pStyle w:val="Heading1"/>
       </w:pPr>
       <w:r>
-        <w:t xml:space="preserve">09 / Proof and referral repurposing — runs after each completed job</w:t>
+        <w:t xml:space="preserve">09 / Proof and referral repurposing - runs after each completed job</w:t>
       </w:r>
     </w:p>
     <w:p>
@@ -1847,7 +1847,7 @@
     <w:lvl w:ilvl="0">
       <w:start w:val="1"/>
       <w:numFmt w:val="bullet"/>
-      <w:lvlText w:val="–"/>
+      <w:lvlText w:val="-"/>
       <w:pPr>
         <w:ind w:left="540" w:hanging="220"/>
       </w:pPr>

</xml_diff>